<commit_message>
Update Calc 3 1.6 worksheet and solutions
Co-Authored-By: Claude Sonnet 5 <noreply@anthropic.com>
</commit_message>
<xml_diff>
--- a/Course Materials/Calc 3/Notes/Ch. 1 (Three-Dimensional Space; Vectors)/Worksheets/1.6 Worksheet.docx
+++ b/Course Materials/Calc 3/Notes/Ch. 1 (Three-Dimensional Space; Vectors)/Worksheets/1.6 Worksheet.docx
@@ -479,7 +479,21 @@
         <w:rPr>
           <w:szCs w:val="28"/>
         </w:rPr>
-        <w:t>The plane through the origin and perpendicular to the vector</w:t>
+        <w:t xml:space="preserve">The plane through </w:t>
+      </w:r>
+      <w:proofErr w:type="gramStart"/>
+      <w:r>
+        <w:rPr>
+          <w:szCs w:val="28"/>
+        </w:rPr>
+        <w:t>the</w:t>
+      </w:r>
+      <w:proofErr w:type="gramEnd"/>
+      <w:r>
+        <w:rPr>
+          <w:szCs w:val="28"/>
+        </w:rPr>
+        <w:t xml:space="preserve"> origin and perpendicular to the vector</w:t>
       </w:r>
       <w:r>
         <w:rPr>
@@ -512,10 +526,10 @@
             <v:path o:extrusionok="f" gradientshapeok="t" o:connecttype="rect"/>
             <o:lock v:ext="edit" aspectratio="t"/>
           </v:shapetype>
-          <v:shape id="_x0000_i1025" type="#_x0000_t75" style="width:42.7pt;height:19.25pt" o:ole="">
+          <v:shape id="_x0000_i1025" type="#_x0000_t75" style="width:42.6pt;height:19.2pt" o:ole="">
             <v:imagedata r:id="rId8" o:title=""/>
           </v:shape>
-          <o:OLEObject Type="Embed" ProgID="Equation.DSMT4" ShapeID="_x0000_i1025" DrawAspect="Content" ObjectID="_1846090446" r:id="rId9"/>
+          <o:OLEObject Type="Embed" ProgID="Equation.DSMT4" ShapeID="_x0000_i1025" DrawAspect="Content" ObjectID="_1850571522" r:id="rId9"/>
         </w:object>
       </w:r>
       <w:r>
@@ -597,7 +611,21 @@
         <w:rPr>
           <w:szCs w:val="28"/>
         </w:rPr>
-        <w:t xml:space="preserve">The plane through the </w:t>
+        <w:t xml:space="preserve">The </w:t>
+      </w:r>
+      <w:proofErr w:type="gramStart"/>
+      <w:r>
+        <w:rPr>
+          <w:szCs w:val="28"/>
+        </w:rPr>
+        <w:t>plane</w:t>
+      </w:r>
+      <w:proofErr w:type="gramEnd"/>
+      <w:r>
+        <w:rPr>
+          <w:szCs w:val="28"/>
+        </w:rPr>
+        <w:t xml:space="preserve"> through the </w:t>
       </w:r>
       <w:r>
         <w:rPr>
@@ -611,10 +639,10 @@
           <w:szCs w:val="28"/>
         </w:rPr>
         <w:object w:dxaOrig="760" w:dyaOrig="400" w14:anchorId="32D8669D">
-          <v:shape id="_x0000_i1026" type="#_x0000_t75" style="width:37.65pt;height:19.25pt" o:ole="">
+          <v:shape id="_x0000_i1026" type="#_x0000_t75" style="width:37.8pt;height:19.2pt" o:ole="">
             <v:imagedata r:id="rId10" o:title=""/>
           </v:shape>
-          <o:OLEObject Type="Embed" ProgID="Equation.DSMT4" ShapeID="_x0000_i1026" DrawAspect="Content" ObjectID="_1846090447" r:id="rId11"/>
+          <o:OLEObject Type="Embed" ProgID="Equation.DSMT4" ShapeID="_x0000_i1026" DrawAspect="Content" ObjectID="_1850571523" r:id="rId11"/>
         </w:object>
       </w:r>
       <w:r>
@@ -629,10 +657,10 @@
           <w:szCs w:val="28"/>
         </w:rPr>
         <w:object w:dxaOrig="920" w:dyaOrig="320" w14:anchorId="6364F081">
-          <v:shape id="_x0000_i1027" type="#_x0000_t75" style="width:46.9pt;height:16.75pt" o:ole="">
+          <v:shape id="_x0000_i1027" type="#_x0000_t75" style="width:46.8pt;height:16.8pt" o:ole="">
             <v:imagedata r:id="rId12" o:title=""/>
           </v:shape>
-          <o:OLEObject Type="Embed" ProgID="Equation.DSMT4" ShapeID="_x0000_i1027" DrawAspect="Content" ObjectID="_1846090448" r:id="rId13"/>
+          <o:OLEObject Type="Embed" ProgID="Equation.DSMT4" ShapeID="_x0000_i1027" DrawAspect="Content" ObjectID="_1850571524" r:id="rId13"/>
         </w:object>
       </w:r>
       <w:r>
@@ -706,7 +734,21 @@
         <w:rPr>
           <w:szCs w:val="28"/>
         </w:rPr>
-        <w:t xml:space="preserve">The plane through the point </w:t>
+        <w:t xml:space="preserve">The </w:t>
+      </w:r>
+      <w:proofErr w:type="gramStart"/>
+      <w:r>
+        <w:rPr>
+          <w:szCs w:val="28"/>
+        </w:rPr>
+        <w:t>plane</w:t>
+      </w:r>
+      <w:proofErr w:type="gramEnd"/>
+      <w:r>
+        <w:rPr>
+          <w:szCs w:val="28"/>
+        </w:rPr>
+        <w:t xml:space="preserve"> through the point </w:t>
       </w:r>
       <w:r>
         <w:rPr>
@@ -714,17 +756,31 @@
           <w:szCs w:val="28"/>
         </w:rPr>
         <w:object w:dxaOrig="740" w:dyaOrig="400" w14:anchorId="684AD3A2">
-          <v:shape id="_x0000_i1028" type="#_x0000_t75" style="width:36.85pt;height:19.25pt" o:ole="">
+          <v:shape id="_x0000_i1028" type="#_x0000_t75" style="width:36.6pt;height:19.2pt" o:ole="">
             <v:imagedata r:id="rId14" o:title=""/>
           </v:shape>
-          <o:OLEObject Type="Embed" ProgID="Equation.DSMT4" ShapeID="_x0000_i1028" DrawAspect="Content" ObjectID="_1846090449" r:id="rId15"/>
+          <o:OLEObject Type="Embed" ProgID="Equation.DSMT4" ShapeID="_x0000_i1028" DrawAspect="Content" ObjectID="_1850571525" r:id="rId15"/>
         </w:object>
       </w:r>
       <w:r>
         <w:rPr>
           <w:szCs w:val="28"/>
         </w:rPr>
-        <w:t xml:space="preserve">and perpendicular to the line </w:t>
+        <w:t xml:space="preserve">and </w:t>
+      </w:r>
+      <w:proofErr w:type="gramStart"/>
+      <w:r>
+        <w:rPr>
+          <w:szCs w:val="28"/>
+        </w:rPr>
+        <w:t>perpendicular</w:t>
+      </w:r>
+      <w:proofErr w:type="gramEnd"/>
+      <w:r>
+        <w:rPr>
+          <w:szCs w:val="28"/>
+        </w:rPr>
+        <w:t xml:space="preserve"> to the line </w:t>
       </w:r>
       <w:r>
         <w:rPr>
@@ -732,10 +788,10 @@
           <w:szCs w:val="28"/>
         </w:rPr>
         <w:object w:dxaOrig="2640" w:dyaOrig="320" w14:anchorId="00C5177B">
-          <v:shape id="_x0000_i1029" type="#_x0000_t75" style="width:132.25pt;height:16.75pt" o:ole="">
+          <v:shape id="_x0000_i1029" type="#_x0000_t75" style="width:132pt;height:16.8pt" o:ole="">
             <v:imagedata r:id="rId16" o:title=""/>
           </v:shape>
-          <o:OLEObject Type="Embed" ProgID="Equation.DSMT4" ShapeID="_x0000_i1029" DrawAspect="Content" ObjectID="_1846090450" r:id="rId17"/>
+          <o:OLEObject Type="Embed" ProgID="Equation.DSMT4" ShapeID="_x0000_i1029" DrawAspect="Content" ObjectID="_1850571526" r:id="rId17"/>
         </w:object>
       </w:r>
       <w:r>
@@ -823,7 +879,21 @@
         <w:rPr>
           <w:szCs w:val="28"/>
         </w:rPr>
-        <w:t xml:space="preserve">The plane through the point </w:t>
+        <w:t xml:space="preserve">The </w:t>
+      </w:r>
+      <w:proofErr w:type="gramStart"/>
+      <w:r>
+        <w:rPr>
+          <w:szCs w:val="28"/>
+        </w:rPr>
+        <w:t>plane</w:t>
+      </w:r>
+      <w:proofErr w:type="gramEnd"/>
+      <w:r>
+        <w:rPr>
+          <w:szCs w:val="28"/>
+        </w:rPr>
+        <w:t xml:space="preserve"> through the point </w:t>
       </w:r>
       <w:r>
         <w:rPr>
@@ -831,10 +901,10 @@
           <w:szCs w:val="28"/>
         </w:rPr>
         <w:object w:dxaOrig="980" w:dyaOrig="400" w14:anchorId="19E62372">
-          <v:shape id="_x0000_i1030" type="#_x0000_t75" style="width:48.55pt;height:19.25pt" o:ole="">
+          <v:shape id="_x0000_i1030" type="#_x0000_t75" style="width:48.6pt;height:19.2pt" o:ole="">
             <v:imagedata r:id="rId18" o:title=""/>
           </v:shape>
-          <o:OLEObject Type="Embed" ProgID="Equation.DSMT4" ShapeID="_x0000_i1030" DrawAspect="Content" ObjectID="_1846090451" r:id="rId19"/>
+          <o:OLEObject Type="Embed" ProgID="Equation.DSMT4" ShapeID="_x0000_i1030" DrawAspect="Content" ObjectID="_1850571527" r:id="rId19"/>
         </w:object>
       </w:r>
       <w:r>
@@ -849,10 +919,10 @@
           <w:szCs w:val="28"/>
         </w:rPr>
         <w:object w:dxaOrig="1340" w:dyaOrig="320" w14:anchorId="05FFACBC">
-          <v:shape id="_x0000_i1031" type="#_x0000_t75" style="width:67pt;height:16.75pt" o:ole="">
+          <v:shape id="_x0000_i1031" type="#_x0000_t75" style="width:67.2pt;height:16.8pt" o:ole="">
             <v:imagedata r:id="rId20" o:title=""/>
           </v:shape>
-          <o:OLEObject Type="Embed" ProgID="Equation.DSMT4" ShapeID="_x0000_i1031" DrawAspect="Content" ObjectID="_1846090452" r:id="rId21"/>
+          <o:OLEObject Type="Embed" ProgID="Equation.DSMT4" ShapeID="_x0000_i1031" DrawAspect="Content" ObjectID="_1850571528" r:id="rId21"/>
         </w:object>
       </w:r>
       <w:r>
@@ -947,7 +1017,13 @@
         <w:rPr>
           <w:szCs w:val="28"/>
         </w:rPr>
-        <w:t xml:space="preserve">The plane through the </w:t>
+        <w:t>A</w:t>
+      </w:r>
+      <w:r>
+        <w:rPr>
+          <w:szCs w:val="28"/>
+        </w:rPr>
+        <w:t xml:space="preserve"> plane through the </w:t>
       </w:r>
       <w:r>
         <w:rPr>
@@ -961,10 +1037,10 @@
           <w:szCs w:val="28"/>
         </w:rPr>
         <w:object w:dxaOrig="780" w:dyaOrig="400" w14:anchorId="0F85497A">
-          <v:shape id="_x0000_i1032" type="#_x0000_t75" style="width:39.35pt;height:19.25pt" o:ole="">
+          <v:shape id="_x0000_i1032" type="#_x0000_t75" style="width:39.6pt;height:19.2pt" o:ole="">
             <v:imagedata r:id="rId22" o:title=""/>
           </v:shape>
-          <o:OLEObject Type="Embed" ProgID="Equation.DSMT4" ShapeID="_x0000_i1032" DrawAspect="Content" ObjectID="_1846090453" r:id="rId23"/>
+          <o:OLEObject Type="Embed" ProgID="Equation.DSMT4" ShapeID="_x0000_i1032" DrawAspect="Content" ObjectID="_1850571529" r:id="rId23"/>
         </w:object>
       </w:r>
       <w:r>
@@ -991,10 +1067,10 @@
           <w:szCs w:val="28"/>
         </w:rPr>
         <w:object w:dxaOrig="900" w:dyaOrig="279" w14:anchorId="1D3BB5F5">
-          <v:shape id="_x0000_i1033" type="#_x0000_t75" style="width:45.2pt;height:13.4pt" o:ole="">
+          <v:shape id="_x0000_i1033" type="#_x0000_t75" style="width:45pt;height:13.2pt" o:ole="">
             <v:imagedata r:id="rId24" o:title=""/>
           </v:shape>
-          <o:OLEObject Type="Embed" ProgID="Equation.DSMT4" ShapeID="_x0000_i1033" DrawAspect="Content" ObjectID="_1846090454" r:id="rId25"/>
+          <o:OLEObject Type="Embed" ProgID="Equation.DSMT4" ShapeID="_x0000_i1033" DrawAspect="Content" ObjectID="_1850571530" r:id="rId25"/>
         </w:object>
       </w:r>
       <w:r>
@@ -1091,10 +1167,10 @@
           <w:szCs w:val="28"/>
         </w:rPr>
         <w:object w:dxaOrig="2520" w:dyaOrig="400" w14:anchorId="494F1201">
-          <v:shape id="_x0000_i1034" type="#_x0000_t75" style="width:126.4pt;height:19.25pt" o:ole="">
+          <v:shape id="_x0000_i1034" type="#_x0000_t75" style="width:126.6pt;height:19.2pt" o:ole="">
             <v:imagedata r:id="rId26" o:title=""/>
           </v:shape>
-          <o:OLEObject Type="Embed" ProgID="Equation.DSMT4" ShapeID="_x0000_i1034" DrawAspect="Content" ObjectID="_1846090455" r:id="rId27"/>
+          <o:OLEObject Type="Embed" ProgID="Equation.DSMT4" ShapeID="_x0000_i1034" DrawAspect="Content" ObjectID="_1850571531" r:id="rId27"/>
         </w:object>
       </w:r>
       <w:r>
@@ -1253,10 +1329,10 @@
           <w:szCs w:val="28"/>
         </w:rPr>
         <w:object w:dxaOrig="1440" w:dyaOrig="400" w14:anchorId="38BA8995">
-          <v:shape id="_x0000_i1035" type="#_x0000_t75" style="width:71.15pt;height:19.25pt" o:ole="">
+          <v:shape id="_x0000_i1035" type="#_x0000_t75" style="width:71.4pt;height:19.2pt" o:ole="">
             <v:imagedata r:id="rId28" o:title=""/>
           </v:shape>
-          <o:OLEObject Type="Embed" ProgID="Equation.DSMT4" ShapeID="_x0000_i1035" DrawAspect="Content" ObjectID="_1846090456" r:id="rId29"/>
+          <o:OLEObject Type="Embed" ProgID="Equation.DSMT4" ShapeID="_x0000_i1035" DrawAspect="Content" ObjectID="_1850571532" r:id="rId29"/>
         </w:object>
       </w:r>
       <w:r>
@@ -1271,10 +1347,10 @@
           <w:szCs w:val="28"/>
         </w:rPr>
         <w:object w:dxaOrig="780" w:dyaOrig="400" w14:anchorId="673CF9EF">
-          <v:shape id="_x0000_i1036" type="#_x0000_t75" style="width:38.5pt;height:19.25pt" o:ole="">
+          <v:shape id="_x0000_i1036" type="#_x0000_t75" style="width:38.4pt;height:19.2pt" o:ole="">
             <v:imagedata r:id="rId30" o:title=""/>
           </v:shape>
-          <o:OLEObject Type="Embed" ProgID="Equation.DSMT4" ShapeID="_x0000_i1036" DrawAspect="Content" ObjectID="_1846090457" r:id="rId31"/>
+          <o:OLEObject Type="Embed" ProgID="Equation.DSMT4" ShapeID="_x0000_i1036" DrawAspect="Content" ObjectID="_1850571533" r:id="rId31"/>
         </w:object>
       </w:r>
       <w:r>
@@ -1511,10 +1587,10 @@
           <w:szCs w:val="28"/>
         </w:rPr>
         <w:object w:dxaOrig="740" w:dyaOrig="400" w14:anchorId="7E9638F6">
-          <v:shape id="_x0000_i1037" type="#_x0000_t75" style="width:37.65pt;height:19.25pt" o:ole="">
+          <v:shape id="_x0000_i1037" type="#_x0000_t75" style="width:37.8pt;height:19.2pt" o:ole="">
             <v:imagedata r:id="rId32" o:title=""/>
           </v:shape>
-          <o:OLEObject Type="Embed" ProgID="Equation.DSMT4" ShapeID="_x0000_i1037" DrawAspect="Content" ObjectID="_1846090458" r:id="rId33"/>
+          <o:OLEObject Type="Embed" ProgID="Equation.DSMT4" ShapeID="_x0000_i1037" DrawAspect="Content" ObjectID="_1850571534" r:id="rId33"/>
         </w:object>
       </w:r>
       <w:r>
@@ -1543,10 +1619,10 @@
           <w:szCs w:val="28"/>
         </w:rPr>
         <w:object w:dxaOrig="2760" w:dyaOrig="320" w14:anchorId="64142861">
-          <v:shape id="_x0000_i1038" type="#_x0000_t75" style="width:137.3pt;height:15.9pt" o:ole="">
+          <v:shape id="_x0000_i1038" type="#_x0000_t75" style="width:137.4pt;height:16.2pt" o:ole="">
             <v:imagedata r:id="rId34" o:title=""/>
           </v:shape>
-          <o:OLEObject Type="Embed" ProgID="Equation.DSMT4" ShapeID="_x0000_i1038" DrawAspect="Content" ObjectID="_1846090459" r:id="rId35"/>
+          <o:OLEObject Type="Embed" ProgID="Equation.DSMT4" ShapeID="_x0000_i1038" DrawAspect="Content" ObjectID="_1850571535" r:id="rId35"/>
         </w:object>
       </w:r>
       <w:r>
@@ -1761,10 +1837,10 @@
           <w:position w:val="-14"/>
         </w:rPr>
         <w:object w:dxaOrig="1140" w:dyaOrig="400" w14:anchorId="1182A80F">
-          <v:shape id="_x0000_i1039" type="#_x0000_t75" style="width:56.95pt;height:19.25pt" o:ole="">
+          <v:shape id="_x0000_i1039" type="#_x0000_t75" style="width:57pt;height:19.2pt" o:ole="">
             <v:imagedata r:id="rId36" o:title=""/>
           </v:shape>
-          <o:OLEObject Type="Embed" ProgID="Equation.DSMT4" ShapeID="_x0000_i1039" DrawAspect="Content" ObjectID="_1846090460" r:id="rId37"/>
+          <o:OLEObject Type="Embed" ProgID="Equation.DSMT4" ShapeID="_x0000_i1039" DrawAspect="Content" ObjectID="_1850571536" r:id="rId37"/>
         </w:object>
       </w:r>
       <w:r>
@@ -1778,10 +1854,10 @@
           <w:position w:val="-14"/>
         </w:rPr>
         <w:object w:dxaOrig="1180" w:dyaOrig="400" w14:anchorId="5C761034">
-          <v:shape id="_x0000_i1040" type="#_x0000_t75" style="width:60.3pt;height:19.25pt" o:ole="">
+          <v:shape id="_x0000_i1040" type="#_x0000_t75" style="width:60pt;height:19.2pt" o:ole="">
             <v:imagedata r:id="rId38" o:title=""/>
           </v:shape>
-          <o:OLEObject Type="Embed" ProgID="Equation.DSMT4" ShapeID="_x0000_i1040" DrawAspect="Content" ObjectID="_1846090461" r:id="rId39"/>
+          <o:OLEObject Type="Embed" ProgID="Equation.DSMT4" ShapeID="_x0000_i1040" DrawAspect="Content" ObjectID="_1850571537" r:id="rId39"/>
         </w:object>
       </w:r>
       <w:r>
@@ -1961,6 +2037,7 @@
         <w:rPr>
           <w:szCs w:val="28"/>
         </w:rPr>
+        <w:lastRenderedPageBreak/>
         <w:t xml:space="preserve">Determine parametric equations for the line which goes through the point </w:t>
       </w:r>
       <w:r>
@@ -1968,10 +2045,10 @@
           <w:position w:val="-14"/>
         </w:rPr>
         <w:object w:dxaOrig="740" w:dyaOrig="400" w14:anchorId="272857B8">
-          <v:shape id="_x0000_i1041" type="#_x0000_t75" style="width:37.65pt;height:19.25pt" o:ole="">
+          <v:shape id="_x0000_i1041" type="#_x0000_t75" style="width:37.8pt;height:19.2pt" o:ole="">
             <v:imagedata r:id="rId40" o:title=""/>
           </v:shape>
-          <o:OLEObject Type="Embed" ProgID="Equation.DSMT4" ShapeID="_x0000_i1041" DrawAspect="Content" ObjectID="_1846090462" r:id="rId41"/>
+          <o:OLEObject Type="Embed" ProgID="Equation.DSMT4" ShapeID="_x0000_i1041" DrawAspect="Content" ObjectID="_1850571538" r:id="rId41"/>
         </w:object>
       </w:r>
       <w:r>
@@ -1985,10 +2062,10 @@
           <w:position w:val="-10"/>
         </w:rPr>
         <w:object w:dxaOrig="1540" w:dyaOrig="320" w14:anchorId="51B9EF08">
-          <v:shape id="_x0000_i1042" type="#_x0000_t75" style="width:76.25pt;height:15.9pt" o:ole="">
+          <v:shape id="_x0000_i1042" type="#_x0000_t75" style="width:76.2pt;height:16.2pt" o:ole="">
             <v:imagedata r:id="rId42" o:title=""/>
           </v:shape>
-          <o:OLEObject Type="Embed" ProgID="Equation.DSMT4" ShapeID="_x0000_i1042" DrawAspect="Content" ObjectID="_1846090463" r:id="rId43"/>
+          <o:OLEObject Type="Embed" ProgID="Equation.DSMT4" ShapeID="_x0000_i1042" DrawAspect="Content" ObjectID="_1850571539" r:id="rId43"/>
         </w:object>
       </w:r>
       <w:r>
@@ -2146,10 +2223,10 @@
           <w:position w:val="-12"/>
         </w:rPr>
         <w:object w:dxaOrig="260" w:dyaOrig="360" w14:anchorId="0F269DA0">
-          <v:shape id="_x0000_i1043" type="#_x0000_t75" style="width:11.7pt;height:18.4pt" o:ole="">
+          <v:shape id="_x0000_i1043" type="#_x0000_t75" style="width:12pt;height:18.6pt" o:ole="">
             <v:imagedata r:id="rId44" o:title=""/>
           </v:shape>
-          <o:OLEObject Type="Embed" ProgID="Equation.DSMT4" ShapeID="_x0000_i1043" DrawAspect="Content" ObjectID="_1846090464" r:id="rId45"/>
+          <o:OLEObject Type="Embed" ProgID="Equation.DSMT4" ShapeID="_x0000_i1043" DrawAspect="Content" ObjectID="_1850571540" r:id="rId45"/>
         </w:object>
       </w:r>
       <w:r>
@@ -2169,10 +2246,10 @@
           <w:position w:val="-12"/>
         </w:rPr>
         <w:object w:dxaOrig="279" w:dyaOrig="360" w14:anchorId="7DAC5AAB">
-          <v:shape id="_x0000_i1044" type="#_x0000_t75" style="width:13.4pt;height:18.4pt" o:ole="">
+          <v:shape id="_x0000_i1044" type="#_x0000_t75" style="width:13.2pt;height:18.6pt" o:ole="">
             <v:imagedata r:id="rId46" o:title=""/>
           </v:shape>
-          <o:OLEObject Type="Embed" ProgID="Equation.DSMT4" ShapeID="_x0000_i1044" DrawAspect="Content" ObjectID="_1846090465" r:id="rId47"/>
+          <o:OLEObject Type="Embed" ProgID="Equation.DSMT4" ShapeID="_x0000_i1044" DrawAspect="Content" ObjectID="_1850571541" r:id="rId47"/>
         </w:object>
       </w:r>
       <w:r>
@@ -2186,10 +2263,10 @@
           <w:position w:val="-12"/>
         </w:rPr>
         <w:object w:dxaOrig="1060" w:dyaOrig="360" w14:anchorId="7FFA5D8F">
-          <v:shape id="_x0000_i1045" type="#_x0000_t75" style="width:53.6pt;height:18.4pt" o:ole="">
+          <v:shape id="_x0000_i1045" type="#_x0000_t75" style="width:53.4pt;height:18.6pt" o:ole="">
             <v:imagedata r:id="rId48" o:title=""/>
           </v:shape>
-          <o:OLEObject Type="Embed" ProgID="Equation.DSMT4" ShapeID="_x0000_i1045" DrawAspect="Content" ObjectID="_1846090466" r:id="rId49"/>
+          <o:OLEObject Type="Embed" ProgID="Equation.DSMT4" ShapeID="_x0000_i1045" DrawAspect="Content" ObjectID="_1850571542" r:id="rId49"/>
         </w:object>
       </w:r>
       <w:r>
@@ -2268,7 +2345,21 @@
         <w:rPr>
           <w:szCs w:val="28"/>
         </w:rPr>
-        <w:t>The planes are equal to each other.</w:t>
+        <w:t xml:space="preserve">The planes are </w:t>
+      </w:r>
+      <w:proofErr w:type="gramStart"/>
+      <w:r>
+        <w:rPr>
+          <w:szCs w:val="28"/>
+        </w:rPr>
+        <w:t>equal to each other</w:t>
+      </w:r>
+      <w:proofErr w:type="gramEnd"/>
+      <w:r>
+        <w:rPr>
+          <w:szCs w:val="28"/>
+        </w:rPr>
+        <w:t>.</w:t>
       </w:r>
     </w:p>
     <w:p>
@@ -2377,10 +2468,10 @@
           <w:szCs w:val="24"/>
         </w:rPr>
         <w:object w:dxaOrig="980" w:dyaOrig="620" w14:anchorId="3B46D78D">
-          <v:shape id="_x0000_i1046" type="#_x0000_t75" style="width:48.55pt;height:31pt" o:ole="">
+          <v:shape id="_x0000_i1046" type="#_x0000_t75" style="width:48.6pt;height:31.2pt" o:ole="">
             <v:imagedata r:id="rId50" o:title=""/>
           </v:shape>
-          <o:OLEObject Type="Embed" ProgID="Equation.DSMT4" ShapeID="_x0000_i1046" DrawAspect="Content" ObjectID="_1846090467" r:id="rId51"/>
+          <o:OLEObject Type="Embed" ProgID="Equation.DSMT4" ShapeID="_x0000_i1046" DrawAspect="Content" ObjectID="_1850571543" r:id="rId51"/>
         </w:object>
       </w:r>
       <w:r>
@@ -2399,10 +2490,10 @@
           <w:szCs w:val="24"/>
         </w:rPr>
         <w:object w:dxaOrig="1200" w:dyaOrig="380" w14:anchorId="24012A1E">
-          <v:shape id="_x0000_i1047" type="#_x0000_t75" style="width:60.3pt;height:18.4pt" o:ole="">
+          <v:shape id="_x0000_i1047" type="#_x0000_t75" style="width:60.6pt;height:18.6pt" o:ole="">
             <v:imagedata r:id="rId52" o:title=""/>
           </v:shape>
-          <o:OLEObject Type="Embed" ProgID="Equation.DSMT4" ShapeID="_x0000_i1047" DrawAspect="Content" ObjectID="_1846090468" r:id="rId53"/>
+          <o:OLEObject Type="Embed" ProgID="Equation.DSMT4" ShapeID="_x0000_i1047" DrawAspect="Content" ObjectID="_1850571544" r:id="rId53"/>
         </w:object>
       </w:r>
       <w:r>
@@ -2429,10 +2520,10 @@
           <w:szCs w:val="24"/>
         </w:rPr>
         <w:object w:dxaOrig="880" w:dyaOrig="279" w14:anchorId="3B08321B">
-          <v:shape id="_x0000_i1048" type="#_x0000_t75" style="width:45.2pt;height:13.4pt" o:ole="">
+          <v:shape id="_x0000_i1048" type="#_x0000_t75" style="width:45pt;height:13.2pt" o:ole="">
             <v:imagedata r:id="rId54" o:title=""/>
           </v:shape>
-          <o:OLEObject Type="Embed" ProgID="Equation.DSMT4" ShapeID="_x0000_i1048" DrawAspect="Content" ObjectID="_1846090469" r:id="rId55"/>
+          <o:OLEObject Type="Embed" ProgID="Equation.DSMT4" ShapeID="_x0000_i1048" DrawAspect="Content" ObjectID="_1850571545" r:id="rId55"/>
         </w:object>
       </w:r>
       <w:r>
@@ -2574,6 +2665,7 @@
         <w:rPr>
           <w:szCs w:val="28"/>
         </w:rPr>
+        <w:lastRenderedPageBreak/>
         <w:t xml:space="preserve">Give a vector </w:t>
       </w:r>
       <w:r>
@@ -2608,10 +2700,10 @@
           <w:szCs w:val="28"/>
         </w:rPr>
         <w:object w:dxaOrig="2840" w:dyaOrig="320" w14:anchorId="13ECEEB9">
-          <v:shape id="_x0000_i1049" type="#_x0000_t75" style="width:140.6pt;height:15.9pt" o:ole="">
+          <v:shape id="_x0000_i1049" type="#_x0000_t75" style="width:140.4pt;height:16.2pt" o:ole="">
             <v:imagedata r:id="rId56" o:title=""/>
           </v:shape>
-          <o:OLEObject Type="Embed" ProgID="Equation.DSMT4" ShapeID="_x0000_i1049" DrawAspect="Content" ObjectID="_1846090470" r:id="rId57"/>
+          <o:OLEObject Type="Embed" ProgID="Equation.DSMT4" ShapeID="_x0000_i1049" DrawAspect="Content" ObjectID="_1850571546" r:id="rId57"/>
         </w:object>
       </w:r>
       <w:r>
@@ -2632,10 +2724,10 @@
           <w:szCs w:val="28"/>
         </w:rPr>
         <w:object w:dxaOrig="2600" w:dyaOrig="320" w14:anchorId="7901F709">
-          <v:shape id="_x0000_i1050" type="#_x0000_t75" style="width:130.65pt;height:15.9pt" o:ole="">
+          <v:shape id="_x0000_i1050" type="#_x0000_t75" style="width:130.8pt;height:16.2pt" o:ole="">
             <v:imagedata r:id="rId58" o:title=""/>
           </v:shape>
-          <o:OLEObject Type="Embed" ProgID="Equation.DSMT4" ShapeID="_x0000_i1050" DrawAspect="Content" ObjectID="_1846090471" r:id="rId59"/>
+          <o:OLEObject Type="Embed" ProgID="Equation.DSMT4" ShapeID="_x0000_i1050" DrawAspect="Content" ObjectID="_1850571547" r:id="rId59"/>
         </w:object>
       </w:r>
       <w:r>
@@ -2780,10 +2872,10 @@
           <w:szCs w:val="28"/>
         </w:rPr>
         <w:object w:dxaOrig="320" w:dyaOrig="300" w14:anchorId="0F7D22B3">
-          <v:shape id="_x0000_i1051" type="#_x0000_t75" style="width:15.9pt;height:15.05pt" o:ole="">
+          <v:shape id="_x0000_i1051" type="#_x0000_t75" style="width:16.2pt;height:15pt" o:ole="">
             <v:imagedata r:id="rId60" o:title=""/>
           </v:shape>
-          <o:OLEObject Type="Embed" ProgID="Equation.DSMT4" ShapeID="_x0000_i1051" DrawAspect="Content" ObjectID="_1846090472" r:id="rId61"/>
+          <o:OLEObject Type="Embed" ProgID="Equation.DSMT4" ShapeID="_x0000_i1051" DrawAspect="Content" ObjectID="_1850571548" r:id="rId61"/>
         </w:object>
       </w:r>
       <w:r>
@@ -3000,10 +3092,10 @@
           <w:szCs w:val="28"/>
         </w:rPr>
         <w:object w:dxaOrig="2720" w:dyaOrig="320" w14:anchorId="712A6309">
-          <v:shape id="_x0000_i1052" type="#_x0000_t75" style="width:135.6pt;height:15.9pt" o:ole="">
+          <v:shape id="_x0000_i1052" type="#_x0000_t75" style="width:135.6pt;height:16.2pt" o:ole="">
             <v:imagedata r:id="rId62" o:title=""/>
           </v:shape>
-          <o:OLEObject Type="Embed" ProgID="Equation.DSMT4" ShapeID="_x0000_i1052" DrawAspect="Content" ObjectID="_1846090473" r:id="rId63"/>
+          <o:OLEObject Type="Embed" ProgID="Equation.DSMT4" ShapeID="_x0000_i1052" DrawAspect="Content" ObjectID="_1850571549" r:id="rId63"/>
         </w:object>
       </w:r>
       <w:r>
@@ -3032,10 +3124,10 @@
           <w:szCs w:val="28"/>
         </w:rPr>
         <w:object w:dxaOrig="1240" w:dyaOrig="320" w14:anchorId="022639B3">
-          <v:shape id="_x0000_i1053" type="#_x0000_t75" style="width:61.95pt;height:15.9pt" o:ole="">
+          <v:shape id="_x0000_i1053" type="#_x0000_t75" style="width:61.8pt;height:16.2pt" o:ole="">
             <v:imagedata r:id="rId64" o:title=""/>
           </v:shape>
-          <o:OLEObject Type="Embed" ProgID="Equation.DSMT4" ShapeID="_x0000_i1053" DrawAspect="Content" ObjectID="_1846090474" r:id="rId65"/>
+          <o:OLEObject Type="Embed" ProgID="Equation.DSMT4" ShapeID="_x0000_i1053" DrawAspect="Content" ObjectID="_1850571550" r:id="rId65"/>
         </w:object>
       </w:r>
       <w:r>
@@ -3159,6 +3251,7 @@
         <w:rPr>
           <w:szCs w:val="28"/>
         </w:rPr>
+        <w:lastRenderedPageBreak/>
         <w:t xml:space="preserve">Let </w:t>
       </w:r>
       <w:r>
@@ -3187,10 +3280,10 @@
           <w:szCs w:val="28"/>
         </w:rPr>
         <w:object w:dxaOrig="840" w:dyaOrig="279" w14:anchorId="165320F1">
-          <v:shape id="_x0000_i1054" type="#_x0000_t75" style="width:41.85pt;height:13.4pt" o:ole="">
+          <v:shape id="_x0000_i1054" type="#_x0000_t75" style="width:42pt;height:13.2pt" o:ole="">
             <v:imagedata r:id="rId66" o:title=""/>
           </v:shape>
-          <o:OLEObject Type="Embed" ProgID="Equation.DSMT4" ShapeID="_x0000_i1054" DrawAspect="Content" ObjectID="_1846090475" r:id="rId67"/>
+          <o:OLEObject Type="Embed" ProgID="Equation.DSMT4" ShapeID="_x0000_i1054" DrawAspect="Content" ObjectID="_1850571551" r:id="rId67"/>
         </w:object>
       </w:r>
       <w:r>
@@ -3225,10 +3318,10 @@
           <w:szCs w:val="28"/>
         </w:rPr>
         <w:object w:dxaOrig="1240" w:dyaOrig="320" w14:anchorId="07B33B80">
-          <v:shape id="_x0000_i1055" type="#_x0000_t75" style="width:61.95pt;height:15.9pt" o:ole="">
+          <v:shape id="_x0000_i1055" type="#_x0000_t75" style="width:61.8pt;height:16.2pt" o:ole="">
             <v:imagedata r:id="rId68" o:title=""/>
           </v:shape>
-          <o:OLEObject Type="Embed" ProgID="Equation.DSMT4" ShapeID="_x0000_i1055" DrawAspect="Content" ObjectID="_1846090476" r:id="rId69"/>
+          <o:OLEObject Type="Embed" ProgID="Equation.DSMT4" ShapeID="_x0000_i1055" DrawAspect="Content" ObjectID="_1850571552" r:id="rId69"/>
         </w:object>
       </w:r>
       <w:r>
@@ -3274,7 +3367,21 @@
         <w:rPr>
           <w:szCs w:val="28"/>
         </w:rPr>
-        <w:t xml:space="preserve"> for the plane </w:t>
+        <w:t xml:space="preserve"> for </w:t>
+      </w:r>
+      <w:proofErr w:type="gramStart"/>
+      <w:r>
+        <w:rPr>
+          <w:szCs w:val="28"/>
+        </w:rPr>
+        <w:t>the plane</w:t>
+      </w:r>
+      <w:proofErr w:type="gramEnd"/>
+      <w:r>
+        <w:rPr>
+          <w:szCs w:val="28"/>
+        </w:rPr>
+        <w:t xml:space="preserve"> </w:t>
       </w:r>
       <w:r>
         <w:rPr>
@@ -3629,17 +3736,31 @@
           <w:szCs w:val="28"/>
         </w:rPr>
         <w:object w:dxaOrig="2540" w:dyaOrig="320" w14:anchorId="73F417C3">
-          <v:shape id="_x0000_i1056" type="#_x0000_t75" style="width:126.35pt;height:15.9pt" o:ole="">
+          <v:shape id="_x0000_i1056" type="#_x0000_t75" style="width:126.6pt;height:16.2pt" o:ole="">
             <v:imagedata r:id="rId70" o:title=""/>
           </v:shape>
-          <o:OLEObject Type="Embed" ProgID="Equation.DSMT4" ShapeID="_x0000_i1056" DrawAspect="Content" ObjectID="_1846090477" r:id="rId71"/>
+          <o:OLEObject Type="Embed" ProgID="Equation.DSMT4" ShapeID="_x0000_i1056" DrawAspect="Content" ObjectID="_1850571553" r:id="rId71"/>
         </w:object>
       </w:r>
       <w:r>
         <w:rPr>
           <w:szCs w:val="28"/>
         </w:rPr>
-        <w:t xml:space="preserve">.  Find the point </w:t>
+        <w:t xml:space="preserve">.  Find </w:t>
+      </w:r>
+      <w:proofErr w:type="gramStart"/>
+      <w:r>
+        <w:rPr>
+          <w:szCs w:val="28"/>
+        </w:rPr>
+        <w:t>the point</w:t>
+      </w:r>
+      <w:proofErr w:type="gramEnd"/>
+      <w:r>
+        <w:rPr>
+          <w:szCs w:val="28"/>
+        </w:rPr>
+        <w:t xml:space="preserve"> </w:t>
       </w:r>
       <w:r>
         <w:rPr>
@@ -3653,7 +3774,35 @@
         <w:rPr>
           <w:szCs w:val="28"/>
         </w:rPr>
-        <w:t xml:space="preserve"> of the intersection of the line </w:t>
+        <w:t xml:space="preserve"> </w:t>
+      </w:r>
+      <w:proofErr w:type="gramStart"/>
+      <w:r>
+        <w:rPr>
+          <w:szCs w:val="28"/>
+        </w:rPr>
+        <w:t>of</w:t>
+      </w:r>
+      <w:proofErr w:type="gramEnd"/>
+      <w:r>
+        <w:rPr>
+          <w:szCs w:val="28"/>
+        </w:rPr>
+        <w:t xml:space="preserve"> the intersection of </w:t>
+      </w:r>
+      <w:proofErr w:type="gramStart"/>
+      <w:r>
+        <w:rPr>
+          <w:szCs w:val="28"/>
+        </w:rPr>
+        <w:t>the line</w:t>
+      </w:r>
+      <w:proofErr w:type="gramEnd"/>
+      <w:r>
+        <w:rPr>
+          <w:szCs w:val="28"/>
+        </w:rPr>
+        <w:t xml:space="preserve"> </w:t>
       </w:r>
       <w:r>
         <w:rPr>
@@ -3675,10 +3824,10 @@
           <w:szCs w:val="28"/>
         </w:rPr>
         <w:object w:dxaOrig="1560" w:dyaOrig="320" w14:anchorId="63464461">
-          <v:shape id="_x0000_i1057" type="#_x0000_t75" style="width:78.7pt;height:15.9pt" o:ole="">
+          <v:shape id="_x0000_i1057" type="#_x0000_t75" style="width:78.6pt;height:16.2pt" o:ole="">
             <v:imagedata r:id="rId72" o:title=""/>
           </v:shape>
-          <o:OLEObject Type="Embed" ProgID="Equation.DSMT4" ShapeID="_x0000_i1057" DrawAspect="Content" ObjectID="_1846090478" r:id="rId73"/>
+          <o:OLEObject Type="Embed" ProgID="Equation.DSMT4" ShapeID="_x0000_i1057" DrawAspect="Content" ObjectID="_1850571554" r:id="rId73"/>
         </w:object>
       </w:r>
       <w:r>
@@ -3801,6 +3950,7 @@
         <w:rPr>
           <w:szCs w:val="28"/>
         </w:rPr>
+        <w:lastRenderedPageBreak/>
         <w:t xml:space="preserve">Let P be the plane with equation </w:t>
       </w:r>
       <w:r>
@@ -3809,10 +3959,10 @@
           <w:szCs w:val="28"/>
         </w:rPr>
         <w:object w:dxaOrig="999" w:dyaOrig="279" w14:anchorId="7BAC5ECB">
-          <v:shape id="_x0000_i1058" type="#_x0000_t75" style="width:49.4pt;height:13.4pt" o:ole="">
+          <v:shape id="_x0000_i1058" type="#_x0000_t75" style="width:49.2pt;height:13.2pt" o:ole="">
             <v:imagedata r:id="rId74" o:title=""/>
           </v:shape>
-          <o:OLEObject Type="Embed" ProgID="Equation.DSMT4" ShapeID="_x0000_i1058" DrawAspect="Content" ObjectID="_1846090479" r:id="rId75"/>
+          <o:OLEObject Type="Embed" ProgID="Equation.DSMT4" ShapeID="_x0000_i1058" DrawAspect="Content" ObjectID="_1850571555" r:id="rId75"/>
         </w:object>
       </w:r>
       <w:r>
@@ -3827,10 +3977,10 @@
           <w:szCs w:val="28"/>
         </w:rPr>
         <w:object w:dxaOrig="880" w:dyaOrig="400" w14:anchorId="1EBD8F54">
-          <v:shape id="_x0000_i1059" type="#_x0000_t75" style="width:45.2pt;height:19.25pt" o:ole="">
+          <v:shape id="_x0000_i1059" type="#_x0000_t75" style="width:45pt;height:19.2pt" o:ole="">
             <v:imagedata r:id="rId76" o:title=""/>
           </v:shape>
-          <o:OLEObject Type="Embed" ProgID="Equation.DSMT4" ShapeID="_x0000_i1059" DrawAspect="Content" ObjectID="_1846090480" r:id="rId77"/>
+          <o:OLEObject Type="Embed" ProgID="Equation.DSMT4" ShapeID="_x0000_i1059" DrawAspect="Content" ObjectID="_1850571556" r:id="rId77"/>
         </w:object>
       </w:r>
       <w:r>
@@ -4036,10 +4186,10 @@
           <w:szCs w:val="28"/>
         </w:rPr>
         <w:object w:dxaOrig="900" w:dyaOrig="400" w14:anchorId="44B07118">
-          <v:shape id="_x0000_i1060" type="#_x0000_t75" style="width:45.2pt;height:20.1pt" o:ole="">
+          <v:shape id="_x0000_i1060" type="#_x0000_t75" style="width:45pt;height:20.4pt" o:ole="">
             <v:imagedata r:id="rId78" o:title=""/>
           </v:shape>
-          <o:OLEObject Type="Embed" ProgID="Equation.DSMT4" ShapeID="_x0000_i1060" DrawAspect="Content" ObjectID="_1846090481" r:id="rId79"/>
+          <o:OLEObject Type="Embed" ProgID="Equation.DSMT4" ShapeID="_x0000_i1060" DrawAspect="Content" ObjectID="_1850571557" r:id="rId79"/>
         </w:object>
       </w:r>
       <w:r>
@@ -4054,10 +4204,10 @@
           <w:szCs w:val="28"/>
         </w:rPr>
         <w:object w:dxaOrig="1460" w:dyaOrig="320" w14:anchorId="30B47482">
-          <v:shape id="_x0000_i1061" type="#_x0000_t75" style="width:72.85pt;height:15.9pt" o:ole="">
+          <v:shape id="_x0000_i1061" type="#_x0000_t75" style="width:72.6pt;height:16.2pt" o:ole="">
             <v:imagedata r:id="rId80" o:title=""/>
           </v:shape>
-          <o:OLEObject Type="Embed" ProgID="Equation.DSMT4" ShapeID="_x0000_i1061" DrawAspect="Content" ObjectID="_1846090482" r:id="rId81"/>
+          <o:OLEObject Type="Embed" ProgID="Equation.DSMT4" ShapeID="_x0000_i1061" DrawAspect="Content" ObjectID="_1850571558" r:id="rId81"/>
         </w:object>
       </w:r>
       <w:r>
@@ -4208,10 +4358,10 @@
           <w:szCs w:val="28"/>
         </w:rPr>
         <w:object w:dxaOrig="1460" w:dyaOrig="320" w14:anchorId="1B37AD0E">
-          <v:shape id="_x0000_i1062" type="#_x0000_t75" style="width:72.85pt;height:15.9pt" o:ole="">
+          <v:shape id="_x0000_i1062" type="#_x0000_t75" style="width:72.6pt;height:16.2pt" o:ole="">
             <v:imagedata r:id="rId82" o:title=""/>
           </v:shape>
-          <o:OLEObject Type="Embed" ProgID="Equation.DSMT4" ShapeID="_x0000_i1062" DrawAspect="Content" ObjectID="_1846090483" r:id="rId83"/>
+          <o:OLEObject Type="Embed" ProgID="Equation.DSMT4" ShapeID="_x0000_i1062" DrawAspect="Content" ObjectID="_1850571559" r:id="rId83"/>
         </w:object>
       </w:r>
       <w:r>
@@ -4226,10 +4376,10 @@
           <w:szCs w:val="28"/>
         </w:rPr>
         <w:object w:dxaOrig="1579" w:dyaOrig="320" w14:anchorId="2E1FA12A">
-          <v:shape id="_x0000_i1063" type="#_x0000_t75" style="width:78.7pt;height:15.9pt" o:ole="">
+          <v:shape id="_x0000_i1063" type="#_x0000_t75" style="width:78.6pt;height:16.2pt" o:ole="">
             <v:imagedata r:id="rId84" o:title=""/>
           </v:shape>
-          <o:OLEObject Type="Embed" ProgID="Equation.DSMT4" ShapeID="_x0000_i1063" DrawAspect="Content" ObjectID="_1846090484" r:id="rId85"/>
+          <o:OLEObject Type="Embed" ProgID="Equation.DSMT4" ShapeID="_x0000_i1063" DrawAspect="Content" ObjectID="_1850571560" r:id="rId85"/>
         </w:object>
       </w:r>
       <w:r>

</xml_diff>